<commit_message>
docs: plano de QA, auditoria do fluxo do profissional e materiais atualizados
- docs/QA_PLANO.md: auditoria do papel nurse ponta a ponta e o plano de QA
  ate a publicacao nas lojas. Achados criticos: a fila offline descarta
  registro clinico em silencio depois de 5 tentativas, e a fila e invisivel
  para quem registra
- CLAUDE.md: nomenclatura, ordem do cadastro no modo empresa, modo autonomo
  e a decisao sobre autonomo x convidado, com o preco escrito
- Propostas, tabela de precos, contrato e Q&A com a terminologia nova.
  Proposta_Enfermeiros renomeada para Proposta_Cuidadores
</commit_message>
<xml_diff>
--- a/docs/Benevita_Contrato_Prestacao_Servico.docx
+++ b/docs/Benevita_Contrato_Prestacao_Servico.docx
@@ -107,7 +107,7 @@
           <w:sz w:val="21"/>
           <w:szCs w:val="21"/>
         </w:rPr>
-        <w:t xml:space="preserve">1.2. O Benevita disponibiliza três perfis de acesso: o perfil de gestão, destinado à CONTRATANTE; o perfil do profissional de enfermagem, destinado à sua equipe; e o perfil da família, destinado aos responsáveis pelos pacientes.</w:t>
+        <w:t>1.2. O Benevita disponibiliza três perfis de acesso: o perfil de gestão, destinado à CONTRATANTE; o perfil do cuidador, destinado à sua equipe; e o perfil da família, destinado aos responsáveis pelos pacientes.</w:t>
       </w:r>
     </w:p>
     <w:p>
@@ -269,7 +269,7 @@
           <w:sz w:val="21"/>
           <w:szCs w:val="21"/>
         </w:rPr>
-        <w:t xml:space="preserve">b) o aplicativo para o profissional de enfermagem, com plantão, registros e funcionamento sem conexão à internet;</w:t>
+        <w:t>b) o aplicativo para o cuidador, com plantão, registros e funcionamento sem conexão à internet;</w:t>
       </w:r>
     </w:p>
     <w:p>
@@ -353,7 +353,7 @@
           <w:sz w:val="22"/>
           <w:szCs w:val="22"/>
         </w:rPr>
-        <w:t xml:space="preserve">CLÁUSULA 4. DO PREÇO E DA APURAÇÃO</w:t>
+        <w:t xml:space="preserve">CLÁUSULA 4. DO PREÇO, DA APURAÇÃO E DAS MODALIDADES</w:t>
       </w:r>
     </w:p>
     <w:p>
@@ -746,6 +746,123 @@
     </w:p>
     <w:p>
       <w:pPr>
+        <w:spacing w:after="140" w:line="276"/>
+        <w:jc w:val="both"/>
+      </w:pPr>
+      <w:r>
+        <w:rPr>
+          <w:sz w:val="21"/>
+          <w:szCs w:val="21"/>
+        </w:rPr>
+        <w:t xml:space="preserve">4.5. Garantia de faixa. O valor total apurado no mês nunca será superior ao que resultaria da quantidade mínima de pacientes da faixa imediatamente superior, com o desconto correspondente àquela faixa. Verificada essa hipótese, prevalece o menor valor, de modo que o crescimento da operação jamais aumente o valor devido em razão da mudança de faixa.</w:t>
+      </w:r>
+    </w:p>
+    <w:p>
+      <w:pPr>
+        <w:spacing w:after="140" w:line="276"/>
+        <w:jc w:val="both"/>
+      </w:pPr>
+      <w:r>
+        <w:rPr>
+          <w:sz w:val="21"/>
+          <w:szCs w:val="21"/>
+        </w:rPr>
+        <w:t xml:space="preserve">4.6. Modalidades de contratação. A CONTRATANTE opta, no ato da assinatura, por uma das modalidades abaixo, assinalando a escolhida:</w:t>
+      </w:r>
+    </w:p>
+    <w:p>
+      <w:pPr>
+        <w:spacing w:after="140" w:line="276"/>
+        <w:jc w:val="both"/>
+      </w:pPr>
+      <w:r>
+        <w:rPr>
+          <w:sz w:val="21"/>
+          <w:szCs w:val="21"/>
+        </w:rPr>
+        <w:t xml:space="preserve">(     ) Modalidade Mensal          (     ) Modalidade Anual</w:t>
+      </w:r>
+    </w:p>
+    <w:p>
+      <w:pPr>
+        <w:spacing w:after="140" w:line="276"/>
+        <w:jc w:val="both"/>
+      </w:pPr>
+      <w:r>
+        <w:rPr>
+          <w:sz w:val="21"/>
+          <w:szCs w:val="21"/>
+        </w:rPr>
+        <w:t xml:space="preserve">4.7. Na Modalidade Mensal, aplica-se o valor previsto no item 4.1 com os descontos por volume do item 4.3, sem desconto adicional.</w:t>
+      </w:r>
+    </w:p>
+    <w:p>
+      <w:pPr>
+        <w:spacing w:after="140" w:line="276"/>
+        <w:jc w:val="both"/>
+      </w:pPr>
+      <w:r>
+        <w:rPr>
+          <w:sz w:val="21"/>
+          <w:szCs w:val="21"/>
+        </w:rPr>
+        <w:t xml:space="preserve">4.8. Na Modalidade Anual, a CONTRATANTE compromete-se a manter a contratação por ciclos de 12 (doze) meses e recebe, em contrapartida, desconto adicional de 10% (dez por cento), incidente sobre o valor já reduzido pelo desconto por volume. A apuração e o faturamento permanecem mensais, na forma desta cláusula, não havendo pagamento antecipado.</w:t>
+      </w:r>
+    </w:p>
+    <w:p>
+      <w:pPr>
+        <w:spacing w:after="140" w:line="276"/>
+        <w:jc w:val="both"/>
+      </w:pPr>
+      <w:r>
+        <w:rPr>
+          <w:sz w:val="21"/>
+          <w:szCs w:val="21"/>
+        </w:rPr>
+        <w:t xml:space="preserve">4.9. Na Modalidade Anual, o valor por paciente permanece inalterado durante todo o ciclo de 12 (doze) meses, não incidindo no curso do ciclo o reajuste previsto na Cláusula 6.</w:t>
+      </w:r>
+    </w:p>
+    <w:p>
+      <w:pPr>
+        <w:spacing w:after="140" w:line="276"/>
+        <w:jc w:val="both"/>
+      </w:pPr>
+      <w:r>
+        <w:rPr>
+          <w:sz w:val="21"/>
+          <w:szCs w:val="21"/>
+        </w:rPr>
+        <w:t xml:space="preserve">4.10. Restituição do desconto. Caso a CONTRATANTE, na Modalidade Anual, rescinda o contrato ou migre para a Modalidade Mensal antes do término do ciclo em curso, restituirá à CONTRATADA a diferença entre os valores efetivamente pagos com o desconto de 10% e os que seriam devidos na Modalidade Mensal, apurada exclusivamente sobre os meses já transcorridos do ciclo. A restituição limita-se ao desconto efetivamente usufruído, não tendo natureza de multa.</w:t>
+      </w:r>
+    </w:p>
+    <w:p>
+      <w:pPr>
+        <w:spacing w:after="140" w:line="276"/>
+        <w:jc w:val="both"/>
+      </w:pPr>
+      <w:r>
+        <w:rPr>
+          <w:sz w:val="21"/>
+          <w:szCs w:val="21"/>
+        </w:rPr>
+        <w:t xml:space="preserve">4.11. Não haverá restituição do desconto quando a rescisão pela CONTRATANTE decorrer de descumprimento contratual da CONTRATADA não sanado no prazo do item 14.10.</w:t>
+      </w:r>
+    </w:p>
+    <w:p>
+      <w:pPr>
+        <w:spacing w:after="140" w:line="276"/>
+        <w:jc w:val="both"/>
+      </w:pPr>
+      <w:r>
+        <w:rPr>
+          <w:sz w:val="21"/>
+          <w:szCs w:val="21"/>
+        </w:rPr>
+        <w:t xml:space="preserve">4.12. A migração da Modalidade Mensal para a Modalidade Anual pode ser solicitada a qualquer tempo, produz efeitos a partir do mês subsequente e inicia novo ciclo de 12 (doze) meses.</w:t>
+      </w:r>
+    </w:p>
+    <w:p>
+      <w:pPr>
         <w:pStyle w:val="Heading2"/>
         <w:spacing w:after="120" w:before="260"/>
       </w:pPr>
@@ -849,7 +966,46 @@
           <w:sz w:val="21"/>
           <w:szCs w:val="21"/>
         </w:rPr>
-        <w:t xml:space="preserve">6.1. O valor previsto na Cláusula 4.1 será reajustado anualmente, a contar da data de assinatura deste contrato, pela variação acumulada do IPCA no período, ou por índice que venha a substituí-lo.</w:t>
+        <w:t xml:space="preserve">6.1. Os valores previstos na Cláusula 4 serão reajustados anualmente, a contar da data de assinatura deste contrato, pela variação acumulada do IPCA no período, ou por índice que venha a substituí-lo.</w:t>
+      </w:r>
+    </w:p>
+    <w:p>
+      <w:pPr>
+        <w:spacing w:after="140" w:line="276"/>
+        <w:jc w:val="both"/>
+      </w:pPr>
+      <w:r>
+        <w:rPr>
+          <w:sz w:val="21"/>
+          <w:szCs w:val="21"/>
+        </w:rPr>
+        <w:t xml:space="preserve">6.2. Na Modalidade Anual, o reajuste incide apenas na renovação do ciclo, sendo comunicado à CONTRATANTE com a antecedência prevista no item 14.3.</w:t>
+      </w:r>
+    </w:p>
+    <w:p>
+      <w:pPr>
+        <w:spacing w:after="140" w:line="276"/>
+        <w:jc w:val="both"/>
+      </w:pPr>
+      <w:r>
+        <w:rPr>
+          <w:sz w:val="21"/>
+          <w:szCs w:val="21"/>
+        </w:rPr>
+        <w:t xml:space="preserve">6.3. Em qualquer modalidade, observa-se a periodicidade mínima anual, sendo nula a estipulação de reajuste em periodicidade inferior, nos termos do art. 2º, § 1º, da Lei nº 10.192/2001.</w:t>
+      </w:r>
+    </w:p>
+    <w:p>
+      <w:pPr>
+        <w:spacing w:after="140" w:line="276"/>
+        <w:jc w:val="both"/>
+      </w:pPr>
+      <w:r>
+        <w:rPr>
+          <w:sz w:val="21"/>
+          <w:szCs w:val="21"/>
+        </w:rPr>
+        <w:t xml:space="preserve">6.4. Caso o índice eleito seja extinto, ou apresente variação que altere substancialmente o equilíbrio econômico do contrato, as partes negociarão de boa-fé a sua substituição por índice equivalente, formalizada por termo aditivo.</w:t>
       </w:r>
     </w:p>
     <w:p>
@@ -988,6 +1144,32 @@
     </w:p>
     <w:p>
       <w:pPr>
+        <w:spacing w:after="140" w:line="276"/>
+        <w:jc w:val="both"/>
+      </w:pPr>
+      <w:r>
+        <w:rPr>
+          <w:sz w:val="21"/>
+          <w:szCs w:val="21"/>
+        </w:rPr>
+        <w:t xml:space="preserve">8.7. Manter rotina periódica de cópia de segurança dos dados tratados, apta a permitir a sua recuperação.</w:t>
+      </w:r>
+    </w:p>
+    <w:p>
+      <w:pPr>
+        <w:spacing w:after="140" w:line="276"/>
+        <w:jc w:val="both"/>
+      </w:pPr>
+      <w:r>
+        <w:rPr>
+          <w:sz w:val="21"/>
+          <w:szCs w:val="21"/>
+        </w:rPr>
+        <w:t xml:space="preserve">8.8. Continuidade. Em caso de descontinuidade da prestação por qualquer motivo, inclusive impossibilidade pessoal da CONTRATADA, esta, ou quem a suceda, disponibilizará à CONTRATANTE a exportação integral dos dados, em formato legível e estruturado, no prazo de 10 (dez) dias contados da ciência do fato. A indisponibilidade do aplicativo por período superior a 15 (quinze) dias consecutivos, por causa imputável à CONTRATADA, faculta à CONTRATANTE rescindir este contrato de imediato, sem qualquer ônus, multa ou restituição de benefícios, assegurada a exportação dos dados.</w:t>
+      </w:r>
+    </w:p>
+    <w:p>
+      <w:pPr>
         <w:pStyle w:val="Heading2"/>
         <w:spacing w:after="120" w:before="260"/>
       </w:pPr>
@@ -1212,7 +1394,7 @@
           <w:sz w:val="21"/>
           <w:szCs w:val="21"/>
         </w:rPr>
-        <w:t xml:space="preserve">10.5. A CONTRATANTE autoriza a CONTRATADA a utilizar a infraestrutura do Google Firebase como suboperadora, para hospedagem e processamento dos dados, permanecendo a CONTRATADA responsável perante a CONTRATANTE pelos atos da suboperadora. A contratação de nova suboperadora será previamente comunicada à CONTRATANTE.</w:t>
+        <w:t xml:space="preserve">10.5. A CONTRATANTE autoriza a CONTRATADA a utilizar a infraestrutura do Google Firebase como suboperadora, para hospedagem e processamento dos dados, permanecendo a CONTRATADA responsável perante a CONTRATANTE pelos atos da suboperadora. Todo suboperador assumirá obrigações de proteção de dados equivalentes às previstas nesta cláusula. A contratação de nova suboperadora será comunicada à CONTRATANTE com antecedência mínima de 30 (trinta) dias, facultando-lhe opor-se de forma justificada, hipótese em que as partes negociarão alternativa e, não havendo acordo, a CONTRATANTE poderá rescindir o contrato sem ônus.</w:t>
       </w:r>
     </w:p>
     <w:p>
@@ -1317,6 +1499,19 @@
           <w:szCs w:val="21"/>
         </w:rPr>
         <w:t xml:space="preserve">10.13. As partes indicam os seguintes canais para assuntos de proteção de dados: pela CONTRATADA, ____________________; pela CONTRATANTE, ____________________.</w:t>
+      </w:r>
+    </w:p>
+    <w:p>
+      <w:pPr>
+        <w:spacing w:after="140" w:line="276"/>
+        <w:jc w:val="both"/>
+      </w:pPr>
+      <w:r>
+        <w:rPr>
+          <w:sz w:val="21"/>
+          <w:szCs w:val="21"/>
+        </w:rPr>
+        <w:t xml:space="preserve">10.14. Transferência internacional. Os dados são armazenados em infraestrutura do Google Cloud Platform. Caso o tratamento envolva transferência internacional de dados pessoais, esta observará as hipóteses e as garantias do art. 33 da Lei nº 13.709/2018, incluindo as cláusulas contratuais padrão e os demais mecanismos aprovados pela Autoridade Nacional de Proteção de Dados. Sempre que tecnicamente disponível, a CONTRATADA adotará configuração de região que privilegie o armazenamento em território nacional, informando à CONTRATANTE a região efetivamente utilizada.</w:t>
       </w:r>
     </w:p>
     <w:p>
@@ -1416,6 +1611,84 @@
     </w:p>
     <w:p>
       <w:pPr>
+        <w:spacing w:after="140" w:line="276"/>
+        <w:jc w:val="both"/>
+      </w:pPr>
+      <w:r>
+        <w:rPr>
+          <w:sz w:val="21"/>
+          <w:szCs w:val="21"/>
+        </w:rPr>
+        <w:t xml:space="preserve">12.4. Níveis de atendimento. A CONTRATADA observará os seguintes prazos, contados do recebimento do chamado pelos canais informados, em dias e horários úteis:</w:t>
+      </w:r>
+    </w:p>
+    <w:p>
+      <w:pPr>
+        <w:spacing w:after="140" w:line="276"/>
+        <w:jc w:val="both"/>
+      </w:pPr>
+      <w:r>
+        <w:rPr>
+          <w:sz w:val="21"/>
+          <w:szCs w:val="21"/>
+        </w:rPr>
+        <w:t xml:space="preserve">a) falha crítica, assim entendida a indisponibilidade total do aplicativo ou a impossibilidade de registrar o cuidado: primeira resposta em até 4 (quatro) horas úteis e correção ou solução de contorno em até 2 (dois) dias úteis;</w:t>
+      </w:r>
+    </w:p>
+    <w:p>
+      <w:pPr>
+        <w:spacing w:after="140" w:line="276"/>
+        <w:jc w:val="both"/>
+      </w:pPr>
+      <w:r>
+        <w:rPr>
+          <w:sz w:val="21"/>
+          <w:szCs w:val="21"/>
+        </w:rPr>
+        <w:t xml:space="preserve">b) falha relevante, que compromete uma funcionalidade sem impedir o uso do aplicativo: primeira resposta em até 1 (um) dia útil e correção em até 5 (cinco) dias úteis;</w:t>
+      </w:r>
+    </w:p>
+    <w:p>
+      <w:pPr>
+        <w:spacing w:after="140" w:line="276"/>
+        <w:jc w:val="both"/>
+      </w:pPr>
+      <w:r>
+        <w:rPr>
+          <w:sz w:val="21"/>
+          <w:szCs w:val="21"/>
+        </w:rPr>
+        <w:t xml:space="preserve">c) dúvidas de uso, orientações e solicitações gerais: primeira resposta em até 2 (dois) dias úteis.</w:t>
+      </w:r>
+    </w:p>
+    <w:p>
+      <w:pPr>
+        <w:spacing w:after="140" w:line="276"/>
+        <w:jc w:val="both"/>
+      </w:pPr>
+      <w:r>
+        <w:rPr>
+          <w:sz w:val="21"/>
+          <w:szCs w:val="21"/>
+        </w:rPr>
+        <w:t xml:space="preserve">12.5. Os prazos do item 12.4 não correm durante as interrupções previstas nos itens 12.1 e 12.3, nem enquanto pendente informação necessária ao diagnóstico que dependa da CONTRATANTE.</w:t>
+      </w:r>
+    </w:p>
+    <w:p>
+      <w:pPr>
+        <w:spacing w:after="140" w:line="276"/>
+        <w:jc w:val="both"/>
+      </w:pPr>
+      <w:r>
+        <w:rPr>
+          <w:sz w:val="21"/>
+          <w:szCs w:val="21"/>
+        </w:rPr>
+        <w:t xml:space="preserve">12.6. O descumprimento reiterado dos prazos do item 12.4, não sanado após notificação, configura descumprimento contratual para os fins do item 14.10.</w:t>
+      </w:r>
+    </w:p>
+    <w:p>
+      <w:pPr>
         <w:pStyle w:val="Heading2"/>
         <w:spacing w:after="120" w:before="260"/>
       </w:pPr>
@@ -1483,6 +1756,32 @@
     </w:p>
     <w:p>
       <w:pPr>
+        <w:spacing w:after="140" w:line="276"/>
+        <w:jc w:val="both"/>
+      </w:pPr>
+      <w:r>
+        <w:rPr>
+          <w:sz w:val="21"/>
+          <w:szCs w:val="21"/>
+        </w:rPr>
+        <w:t xml:space="preserve">13.5. Natureza do software e conformidade regulatória. O Benevita não possui certificação da Sociedade Brasileira de Informática em Saúde nem do Conselho Federal de Medicina como sistema de registro eletrônico em saúde, e não substitui o prontuário que a CONTRATANTE esteja obrigada a manter por exigência do seu conselho profissional ou da legislação sanitária. Cabe exclusivamente à CONTRATANTE avaliar a suficiência do aplicativo diante das suas obrigações regulatórias e manter os registros exigidos pela autoridade competente.</w:t>
+      </w:r>
+    </w:p>
+    <w:p>
+      <w:pPr>
+        <w:spacing w:after="140" w:line="276"/>
+        <w:jc w:val="both"/>
+      </w:pPr>
+      <w:r>
+        <w:rPr>
+          <w:sz w:val="21"/>
+          <w:szCs w:val="21"/>
+        </w:rPr>
+        <w:t xml:space="preserve">13.6. O Benevita não é dispositivo médico e não se destina a diagnóstico, prescrição, monitoramento clínico automatizado ou qualquer finalidade sujeita a registro sanitário.</w:t>
+      </w:r>
+    </w:p>
+    <w:p>
+      <w:pPr>
         <w:pStyle w:val="Heading2"/>
         <w:spacing w:after="120" w:before="260"/>
       </w:pPr>
@@ -1506,85 +1805,124 @@
           <w:sz w:val="21"/>
           <w:szCs w:val="21"/>
         </w:rPr>
-        <w:t xml:space="preserve">14.1. Este contrato vigora pelo prazo inicial de 12 (doze) meses, contados da data de sua assinatura, prorrogando-se automaticamente por prazo indeterminado ao final desse período, caso nenhuma das partes se manifeste em contrário.</w:t>
-      </w:r>
-    </w:p>
-    <w:p>
-      <w:pPr>
-        <w:spacing w:after="140" w:line="276"/>
-        <w:jc w:val="both"/>
-      </w:pPr>
-      <w:r>
-        <w:rPr>
-          <w:sz w:val="21"/>
-          <w:szCs w:val="21"/>
-        </w:rPr>
-        <w:t xml:space="preserve">14.2. O prazo inicial previsto no item 14.1 destina-se a amortizar os investimentos da CONTRATADA na implantação, na publicação nas lojas de aplicativos e no treinamento da equipe, todos fornecidos sem custo adicional nos termos da Cláusula 3.</w:t>
-      </w:r>
-    </w:p>
-    <w:p>
-      <w:pPr>
-        <w:spacing w:after="140" w:line="276"/>
-        <w:jc w:val="both"/>
-      </w:pPr>
-      <w:r>
-        <w:rPr>
-          <w:sz w:val="21"/>
-          <w:szCs w:val="21"/>
-        </w:rPr>
-        <w:t xml:space="preserve">14.3. Após o prazo inicial, qualquer das partes poderá rescindir este contrato, imotivadamente, mediante aviso prévio por escrito de 30 (trinta) dias, sem incidência de multa rescisória.</w:t>
-      </w:r>
-    </w:p>
-    <w:p>
-      <w:pPr>
-        <w:spacing w:after="140" w:line="276"/>
-        <w:jc w:val="both"/>
-      </w:pPr>
-      <w:r>
-        <w:rPr>
-          <w:sz w:val="21"/>
-          <w:szCs w:val="21"/>
-        </w:rPr>
-        <w:t xml:space="preserve">14.4. Caso a CONTRATANTE rescinda o contrato imotivadamente antes do término do prazo inicial, será devida à CONTRATADA, a título de ressarcimento dos investimentos de implantação, multa correspondente a 30% (trinta por cento) das mensalidades vincendas até o termo final do prazo inicial, calculadas com base na média das 3 (três) últimas faturas.</w:t>
-      </w:r>
-    </w:p>
-    <w:p>
-      <w:pPr>
-        <w:spacing w:after="140" w:line="276"/>
-        <w:jc w:val="both"/>
-      </w:pPr>
-      <w:r>
-        <w:rPr>
-          <w:sz w:val="21"/>
-          <w:szCs w:val="21"/>
-        </w:rPr>
-        <w:t xml:space="preserve">14.5. Não incide a multa do item 14.4 quando a rescisão pela CONTRATANTE decorrer de descumprimento contratual da CONTRATADA não sanado no prazo do item 14.7.</w:t>
-      </w:r>
-    </w:p>
-    <w:p>
-      <w:pPr>
-        <w:spacing w:after="140" w:line="276"/>
-        <w:jc w:val="both"/>
-      </w:pPr>
-      <w:r>
-        <w:rPr>
-          <w:sz w:val="21"/>
-          <w:szCs w:val="21"/>
-        </w:rPr>
-        <w:t xml:space="preserve">14.6. A rescisão não afasta a obrigação de pagamento dos valores apurados até a data do efetivo encerramento.</w:t>
-      </w:r>
-    </w:p>
-    <w:p>
-      <w:pPr>
-        <w:spacing w:after="140" w:line="276"/>
-        <w:jc w:val="both"/>
-      </w:pPr>
-      <w:r>
-        <w:rPr>
-          <w:sz w:val="21"/>
-          <w:szCs w:val="21"/>
-        </w:rPr>
-        <w:t xml:space="preserve">14.7. Este contrato poderá ser rescindido de imediato, por qualquer das partes, em caso de descumprimento de obrigação não sanada no prazo de 15 (quinze) dias contados da notificação. A CONTRATADA poderá ainda rescindi-lo de imediato em caso de atraso de pagamento superior a 60 (sessenta) dias.</w:t>
+        <w:t xml:space="preserve">14.1. Na Modalidade Mensal, este contrato vigora por prazo indeterminado a contar da data de sua assinatura, sem prazo mínimo de permanência. Qualquer das partes poderá rescindi-lo imotivadamente, a qualquer tempo, observado o aviso prévio do item 14.5, sem incidência de cláusula penal.</w:t>
+      </w:r>
+    </w:p>
+    <w:p>
+      <w:pPr>
+        <w:spacing w:after="140" w:line="276"/>
+        <w:jc w:val="both"/>
+      </w:pPr>
+      <w:r>
+        <w:rPr>
+          <w:sz w:val="21"/>
+          <w:szCs w:val="21"/>
+        </w:rPr>
+        <w:t xml:space="preserve">14.2. Na Modalidade Anual, este contrato vigora por ciclos de 12 (doze) meses, contados da data de sua assinatura, renovando-se automaticamente por novos ciclos de igual duração, salvo manifestação por escrito de qualquer das partes com antecedência mínima de 30 (trinta) dias do término do ciclo em curso.</w:t>
+      </w:r>
+    </w:p>
+    <w:p>
+      <w:pPr>
+        <w:spacing w:after="140" w:line="276"/>
+        <w:jc w:val="both"/>
+      </w:pPr>
+      <w:r>
+        <w:rPr>
+          <w:sz w:val="21"/>
+          <w:szCs w:val="21"/>
+        </w:rPr>
+        <w:t xml:space="preserve">14.3. A CONTRATADA comunicará à CONTRATANTE, com antecedência mínima de 30 (trinta) dias do término de cada ciclo, a renovação, o valor aplicável e o eventual reajuste, de modo a assegurar-lhe a manifestação tempestiva. A ausência dessa comunicação faculta à CONTRATANTE rescindir o contrato, sem restituição de desconto e sem cláusula penal, no prazo de 30 (trinta) dias contados do início do novo ciclo.</w:t>
+      </w:r>
+    </w:p>
+    <w:p>
+      <w:pPr>
+        <w:spacing w:after="140" w:line="276"/>
+        <w:jc w:val="both"/>
+      </w:pPr>
+      <w:r>
+        <w:rPr>
+          <w:sz w:val="21"/>
+          <w:szCs w:val="21"/>
+        </w:rPr>
+        <w:t xml:space="preserve">14.4. Na Modalidade Anual, a rescisão imotivada pela CONTRATANTE antes do término do ciclo em curso sujeita-a à restituição do desconto prevista no item 4.10 e à cláusula penal do item 14.6.</w:t>
+      </w:r>
+    </w:p>
+    <w:p>
+      <w:pPr>
+        <w:spacing w:after="140" w:line="276"/>
+        <w:jc w:val="both"/>
+      </w:pPr>
+      <w:r>
+        <w:rPr>
+          <w:sz w:val="21"/>
+          <w:szCs w:val="21"/>
+        </w:rPr>
+        <w:t xml:space="preserve">14.5. Aviso prévio. A rescisão imotivada por qualquer das partes exige aviso prévio por escrito de 30 (trinta) dias. A parte que rescindir sem observar esse prazo indenizará a outra em valor equivalente a 1 (uma) mensalidade, apurada pela média das 3 (três) últimas faturas, a título de compensação pelo período de aviso não cumprido. Essa indenização não tem natureza de cláusula penal e é devida em qualquer das modalidades.</w:t>
+      </w:r>
+    </w:p>
+    <w:p>
+      <w:pPr>
+        <w:spacing w:after="140" w:line="276"/>
+        <w:jc w:val="both"/>
+      </w:pPr>
+      <w:r>
+        <w:rPr>
+          <w:sz w:val="21"/>
+          <w:szCs w:val="21"/>
+        </w:rPr>
+        <w:t xml:space="preserve">14.6. Cláusula penal na Modalidade Anual. A rescisão imotivada pela CONTRATANTE antes do término do ciclo em curso sujeita-a a cláusula penal correspondente a 10% (dez por cento) das mensalidades vincendas até o termo final do ciclo, calculadas pela média das 3 (três) últimas faturas. A cláusula penal reduz-se automaticamente à medida que o ciclo é cumprido, uma vez que incide apenas sobre as mensalidades ainda não vencidas.</w:t>
+      </w:r>
+    </w:p>
+    <w:p>
+      <w:pPr>
+        <w:spacing w:after="140" w:line="276"/>
+        <w:jc w:val="both"/>
+      </w:pPr>
+      <w:r>
+        <w:rPr>
+          <w:sz w:val="21"/>
+          <w:szCs w:val="21"/>
+        </w:rPr>
+        <w:t xml:space="preserve">14.7. Limites das penalidades. A soma da restituição do desconto prevista no item 4.10 com a cláusula penal do item 14.6 não excederá, em nenhuma hipótese, o valor total das mensalidades vincendas até o termo final do ciclo, nos termos do art. 412 do Código Civil. Cumprida em parte a obrigação, ou mostrando-se a penalidade manifestamente excessiva diante da natureza e da finalidade deste contrato, as partes desde já reconhecem a possibilidade de sua redução equitativa, nos termos do art. 413 do Código Civil.</w:t>
+      </w:r>
+    </w:p>
+    <w:p>
+      <w:pPr>
+        <w:spacing w:after="140" w:line="276"/>
+        <w:jc w:val="both"/>
+      </w:pPr>
+      <w:r>
+        <w:rPr>
+          <w:sz w:val="21"/>
+          <w:szCs w:val="21"/>
+        </w:rPr>
+        <w:t xml:space="preserve">14.8. Não incidem a indenização do item 14.5, a cláusula penal do item 14.6 nem a restituição do item 4.10 quando a rescisão decorrer de descumprimento contratual da outra parte não sanado no prazo do item 14.10, nem nas hipóteses previstas nos itens 8.8 e 14.3.</w:t>
+      </w:r>
+    </w:p>
+    <w:p>
+      <w:pPr>
+        <w:spacing w:after="140" w:line="276"/>
+        <w:jc w:val="both"/>
+      </w:pPr>
+      <w:r>
+        <w:rPr>
+          <w:sz w:val="21"/>
+          <w:szCs w:val="21"/>
+        </w:rPr>
+        <w:t xml:space="preserve">14.9. A rescisão não afasta a obrigação de pagamento dos valores apurados até a data do efetivo encerramento.</w:t>
+      </w:r>
+    </w:p>
+    <w:p>
+      <w:pPr>
+        <w:spacing w:after="140" w:line="276"/>
+        <w:jc w:val="both"/>
+      </w:pPr>
+      <w:r>
+        <w:rPr>
+          <w:sz w:val="21"/>
+          <w:szCs w:val="21"/>
+        </w:rPr>
+        <w:t xml:space="preserve">14.10. Este contrato poderá ser rescindido de imediato, por qualquer das partes, em caso de descumprimento de obrigação não sanada no prazo de 15 (quinze) dias contados da notificação. A CONTRATADA poderá ainda rescindi-lo de imediato em caso de atraso de pagamento superior a 60 (sessenta) dias.</w:t>
       </w:r>
     </w:p>
     <w:p>
@@ -1703,7 +2041,20 @@
           <w:sz w:val="21"/>
           <w:szCs w:val="21"/>
         </w:rPr>
-        <w:t xml:space="preserve">15.8. As partes elegem o foro da comarca de Feira de Santana, Estado da Bahia, domicílio da CONTRATADA, para dirimir as controvérsias oriundas deste contrato, com renúncia a qualquer outro, por mais privilegiado que seja.</w:t>
+        <w:t xml:space="preserve">15.8. A assinatura será colhida por provedor de assinatura eletrônica que ateste a autoria e a integridade do documento. As partes reconhecem que, nessa hipótese, fica dispensada a assinatura de testemunhas, nos termos do art. 784, § 4º, do Código de Processo Civil, acrescido pela Lei nº 14.620/2023, conservando o instrumento a natureza de título executivo extrajudicial.</w:t>
+      </w:r>
+    </w:p>
+    <w:p>
+      <w:pPr>
+        <w:spacing w:after="140" w:line="276"/>
+        <w:jc w:val="both"/>
+      </w:pPr>
+      <w:r>
+        <w:rPr>
+          <w:sz w:val="21"/>
+          <w:szCs w:val="21"/>
+        </w:rPr>
+        <w:t xml:space="preserve">15.9. As partes elegem o foro da comarca de Feira de Santana, Estado da Bahia, domicílio da CONTRATADA, para dirimir as controvérsias oriundas deste contrato, com renúncia a qualquer outro, por mais privilegiado que seja.</w:t>
       </w:r>
     </w:p>
     <w:p>
@@ -1716,7 +2067,7 @@
           <w:sz w:val="21"/>
           <w:szCs w:val="21"/>
         </w:rPr>
-        <w:t xml:space="preserve">E, por estarem assim justas e contratadas, as partes assinam o presente instrumento, na presença de duas testemunhas, em duas vias de igual teor e forma.</w:t>
+        <w:t xml:space="preserve">E, por estarem assim justas e contratadas, as partes assinam o presente instrumento por meio eletrônico, em via única, que produz todos os efeitos legais.</w:t>
       </w:r>
     </w:p>
     <w:p>
@@ -1792,75 +2143,6 @@
           <w:szCs w:val="21"/>
         </w:rPr>
         <w:t xml:space="preserve">______________________________________________</w:t>
-      </w:r>
-    </w:p>
-    <w:p>
-      <w:pPr>
-        <w:spacing w:after="400" w:line="276"/>
-        <w:jc w:val="both"/>
-      </w:pPr>
-      <w:r>
-        <w:rPr>
-          <w:b/>
-          <w:bCs/>
-          <w:sz w:val="21"/>
-          <w:szCs w:val="21"/>
-        </w:rPr>
-        <w:t xml:space="preserve">TESTEMUNHAS:</w:t>
-      </w:r>
-    </w:p>
-    <w:p>
-      <w:pPr>
-        <w:pBdr>
-          <w:top w:val="single" w:color="000000" w:sz="6" w:space="6"/>
-        </w:pBdr>
-        <w:spacing w:after="40" w:before="300"/>
-      </w:pPr>
-      <w:r>
-        <w:rPr>
-          <w:sz w:val="21"/>
-          <w:szCs w:val="21"/>
-        </w:rPr>
-        <w:t xml:space="preserve">1. Nome: ______________________________________________</w:t>
-      </w:r>
-    </w:p>
-    <w:p>
-      <w:pPr>
-        <w:spacing w:after="400"/>
-      </w:pPr>
-      <w:r>
-        <w:rPr>
-          <w:sz w:val="21"/>
-          <w:szCs w:val="21"/>
-        </w:rPr>
-        <w:t xml:space="preserve">    CPF: ____________________</w:t>
-      </w:r>
-    </w:p>
-    <w:p>
-      <w:pPr>
-        <w:pBdr>
-          <w:top w:val="single" w:color="000000" w:sz="6" w:space="6"/>
-        </w:pBdr>
-        <w:spacing w:after="40" w:before="300"/>
-      </w:pPr>
-      <w:r>
-        <w:rPr>
-          <w:sz w:val="21"/>
-          <w:szCs w:val="21"/>
-        </w:rPr>
-        <w:t xml:space="preserve">2. Nome: ______________________________________________</w:t>
-      </w:r>
-    </w:p>
-    <w:p>
-      <w:pPr>
-        <w:spacing w:after="200"/>
-      </w:pPr>
-      <w:r>
-        <w:rPr>
-          <w:sz w:val="21"/>
-          <w:szCs w:val="21"/>
-        </w:rPr>
-        <w:t xml:space="preserve">    CPF: ____________________</w:t>
       </w:r>
     </w:p>
     <w:sectPr>

</xml_diff>